<commit_message>
remove issuer section for investor
</commit_message>
<xml_diff>
--- a/apps/api/src/modules/notes/investment-note-certificate/templates/islamic-investment-note-certificate-v1.docx
+++ b/apps/api/src/modules/notes/investment-note-certificate/templates/islamic-investment-note-certificate-v1.docx
@@ -382,7 +382,6 @@
                 <w:szCs w:val="17"/>
               </w:rPr>
             </w:pPr>
-            <w:commentRangeStart w:id="0"/>
             <w:r>
               <w:rPr>
                 <w:rFonts w:ascii="Arial" w:hAnsi="Arial"/>
@@ -392,7 +391,7 @@
                 <w:sz w:val="17"/>
                 <w:szCs w:val="17"/>
               </w:rPr>
-              <w:t>Issuer</w:t>
+              <w:t>{#showIssuerLegalIdentity}Issuer</w:t>
             </w:r>
           </w:p>
         </w:tc>
@@ -483,7 +482,7 @@
                 <w:sz w:val="17"/>
                 <w:szCs w:val="17"/>
               </w:rPr>
-              <w:t>{companyRegistration}</w:t>
+              <w:t>{companyRegistration}{/showIssuerLegalIdentity}</w:t>
             </w:r>
           </w:p>
         </w:tc>

</xml_diff>

<commit_message>
joinng with mark disbursmetn and adding paltform setting
</commit_message>
<xml_diff>
--- a/apps/api/src/modules/notes/investment-note-certificate/templates/islamic-investment-note-certificate-v1.docx
+++ b/apps/api/src/modules/notes/investment-note-certificate/templates/islamic-investment-note-certificate-v1.docx
@@ -2060,7 +2060,7 @@
                 <w:sz w:val="14"/>
               </w:rPr>
               <w:br/>
-              <w:t>Name / Date: __________________</w:t>
+              <w:t>Name / Date: {signatoryNameAndDate}</w:t>
             </w:r>
           </w:p>
         </w:tc>
@@ -2076,7 +2076,7 @@
                 <w:color w:val="666666"/>
                 <w:sz w:val="14"/>
               </w:rPr>
-              <w:t>________________________</w:t>
+              <w:t>§COMPANY_STAMP_IMAGE§</w:t>
             </w:r>
             <w:r>
               <w:rPr>

</xml_diff>